<commit_message>
Fix stale references surfaced by retrospective audit (no version bumps)
Change Orders Register: corrected stale System Level Map V7_r2 / System Operations V7_r2 sibling citations to V1.0 / L2D V1.0 (4 instances, round 2 of this fix).

Architecture Map: closed the known, previously-deferred CO-012 gap - Layer 10's direct ElevenLabs reference now points to System Operations, which exists as a real filed document.

L2B Critic Role Description: removed two hardcoded seven-deployment-output references per V7 Upgrade Reference #7.

System Level Map: corrected System Operations work-order entry to reflect its actual filed location (L2D) and actual review outcome (blur pairings and TC-001 citation retained per live Critic judgment, confirmed by project lead). Corrected Phase Status's blur-pairings instruction. Note: System Level Map still lacks a full LEVEL 2D section - flagged as a remaining gap.
</commit_message>
<xml_diff>
--- a/L2A-System-Architecture/CiC_L2A_Architecture_Map_V2_2.docx
+++ b/L2A-System-Architecture/CiC_L2A_Architecture_Map_V2_2.docx
@@ -409,8 +409,6 @@
     <w:p>
       <w:r>
         <w:t xml:space="preserve">High for Essential Experience and Psychological Foundations, now at V2.1. Three experiential encodings carry the open flag from Constitution V2.2 — provisional pending external scholarly review with formation-theology expertise: the Witness-Not-Recruitment </w:t>
-      </w:r>
-      <w:r>
         <w:lastRenderedPageBreak/>
         <w:t>boundary as an experiential commitment, the Christ-Ward Telos as an experiential direction, and the named-absence principle as a participant-facing encounter. The Five Convictions in the Theological Foundation are not provisional — they are the supreme governing convictions from which the architecture is derived and are not subject to external review for validation.</w:t>
       </w:r>
@@ -1089,8 +1087,6 @@
     <w:p>
       <w:r>
         <w:t xml:space="preserve">AI Review, Source Verification, Cross-World Contamination Review, Strand Determination Verification, Writing-From-Inside Review, Representative Readiness Review, Living Tradition Status Confirmation (Article 29), External Scholarly Review (Article 31), </w:t>
-      </w:r>
-      <w:r>
         <w:lastRenderedPageBreak/>
         <w:t>Adversarial Resistance Review (Article 32) — see the Construction Framework and the Deployment Standards document for checkpoint sequencing, tool assignment, and reviewer requirements.</w:t>
       </w:r>
@@ -1761,7 +1757,7 @@
         <w:pStyle w:val="ListBullet"/>
       </w:pPr>
       <w:r>
-        <w:t>Voice Configuration (ElevenLabs operational configuration — per-world deployment document)</w:t>
+        <w:t>Voice Configuration (see System Operations — per-world deployment document)</w:t>
       </w:r>
     </w:p>
     <w:p>

</xml_diff>